<commit_message>
docs(qms): point test records at the per-run execution folders
Co-Authored-By: Claude Opus 5.5 <noreply@anthropic.com>
</commit_message>
<xml_diff>
--- a/docs/qms/evidence-2026/15_Testing/Failures/QA-FAIL-2026-01_Unit_tests_and_frontend_type_check_faili.docx
+++ b/docs/qms/evidence-2026/15_Testing/Failures/QA-FAIL-2026-01_Unit_tests_and_frontend_type_check_faili.docx
@@ -972,25 +972,10 @@
           <w:sz w:val="19"/>
           <w:szCs w:val="19"/>
         </w:rPr>
-        <w:t xml:space="preserve">15_Testing/Execution_Records/execution_log.txt</w:t>
-      </w:r>
-    </w:p>
-    <w:p>
-      <w:pPr>
-        <w:pStyle w:val="ListParagraph"/>
-        <w:numPr>
-          <w:ilvl w:val="0"/>
-          <w:numId w:val="2"/>
-        </w:numPr>
-        <w:spacing w:after="60"/>
-      </w:pPr>
-      <w:r>
-        <w:rPr>
-          <w:rFonts w:ascii="Consolas" w:cs="Consolas" w:eastAsia="Consolas" w:hAnsi="Consolas"/>
-          <w:sz w:val="19"/>
-          <w:szCs w:val="19"/>
-        </w:rPr>
-        <w:t xml:space="preserve">15_Testing/Execution_Records/results.json</w:t>
+        <w:t xml:space="preserve">15_Testing/Execution_Records/run1…run4/</w:t>
+      </w:r>
+      <w:r>
+        <w:t xml:space="preserve"> — execution_log.txt and results.json per run</w:t>
       </w:r>
     </w:p>
     <w:sectPr>

</xml_diff>